<commit_message>
Voor Night University Junior en MFT
</commit_message>
<xml_diff>
--- a/Extra/Voorbeelden van vilt en garen/Kleuren vilt en garen v2.docx
+++ b/Extra/Voorbeelden van vilt en garen/Kleuren vilt en garen v2.docx
@@ -148,6 +148,9 @@
         </w:numPr>
       </w:pPr>
       <w:r>
+        <w:t xml:space="preserve">+ </w:t>
+      </w:r>
+      <w:r>
         <w:t>Rood donkerrood</w:t>
       </w:r>
     </w:p>
@@ -160,6 +163,9 @@
         </w:numPr>
       </w:pPr>
       <w:r>
+        <w:t xml:space="preserve">+ </w:t>
+      </w:r>
+      <w:r>
         <w:t>Oud roze</w:t>
       </w:r>
     </w:p>
@@ -172,10 +178,183 @@
         </w:numPr>
       </w:pPr>
       <w:r>
+        <w:t xml:space="preserve">+ </w:t>
+      </w:r>
+      <w:r>
+        <w:t>Kobalt</w:t>
+      </w:r>
+    </w:p>
+    <w:p>
+      <w:pPr>
+        <w:pStyle w:val="ListParagraph"/>
+        <w:numPr>
+          <w:ilvl w:val="0"/>
+          <w:numId w:val="2"/>
+        </w:numPr>
+      </w:pPr>
+      <w:r>
+        <w:t xml:space="preserve">+ </w:t>
+      </w:r>
+      <w:r>
+        <w:t>Zwart</w:t>
+      </w:r>
+    </w:p>
+    <w:p>
+      <w:pPr>
+        <w:pStyle w:val="ListParagraph"/>
+        <w:numPr>
+          <w:ilvl w:val="0"/>
+          <w:numId w:val="2"/>
+        </w:numPr>
+      </w:pPr>
+      <w:r>
+        <w:t xml:space="preserve">+ </w:t>
+      </w:r>
+      <w:r>
+        <w:t xml:space="preserve">Rood </w:t>
+      </w:r>
+      <w:proofErr w:type="spellStart"/>
+      <w:r>
+        <w:t>rood</w:t>
+      </w:r>
+      <w:proofErr w:type="spellEnd"/>
+    </w:p>
+    <w:p>
+      <w:pPr>
+        <w:pStyle w:val="ListParagraph"/>
+        <w:numPr>
+          <w:ilvl w:val="0"/>
+          <w:numId w:val="2"/>
+        </w:numPr>
+      </w:pPr>
+      <w:r>
+        <w:t>+</w:t>
+      </w:r>
+      <w:r>
+        <w:t xml:space="preserve"> </w:t>
+      </w:r>
+      <w:r>
+        <w:t>Den</w:t>
+      </w:r>
+    </w:p>
+    <w:p>
+      <w:pPr>
+        <w:pStyle w:val="ListParagraph"/>
+        <w:numPr>
+          <w:ilvl w:val="0"/>
+          <w:numId w:val="2"/>
+        </w:numPr>
+      </w:pPr>
+      <w:r>
+        <w:t>+</w:t>
+      </w:r>
+      <w:r>
+        <w:t xml:space="preserve"> </w:t>
+      </w:r>
+      <w:r>
+        <w:t>Fel oranje</w:t>
+      </w:r>
+    </w:p>
+    <w:p>
+      <w:pPr>
+        <w:pStyle w:val="ListParagraph"/>
+        <w:numPr>
+          <w:ilvl w:val="0"/>
+          <w:numId w:val="2"/>
+        </w:numPr>
+      </w:pPr>
+      <w:r>
+        <w:t>+</w:t>
+      </w:r>
+      <w:r>
+        <w:t xml:space="preserve"> </w:t>
+      </w:r>
+      <w:r>
+        <w:t>Geel</w:t>
+      </w:r>
+    </w:p>
+    <w:p>
+      <w:pPr>
+        <w:pStyle w:val="ListParagraph"/>
+        <w:numPr>
+          <w:ilvl w:val="0"/>
+          <w:numId w:val="2"/>
+        </w:numPr>
+      </w:pPr>
+      <w:r>
+        <w:t>+</w:t>
+      </w:r>
+      <w:r>
+        <w:t xml:space="preserve"> </w:t>
+      </w:r>
+      <w:r>
+        <w:t>Roze</w:t>
+      </w:r>
+    </w:p>
+    <w:p>
+      <w:pPr>
+        <w:pStyle w:val="ListParagraph"/>
+        <w:numPr>
+          <w:ilvl w:val="0"/>
+          <w:numId w:val="2"/>
+        </w:numPr>
+      </w:pPr>
+      <w:r>
+        <w:t>+</w:t>
+      </w:r>
+      <w:r>
+        <w:t xml:space="preserve"> </w:t>
+      </w:r>
+      <w:r>
+        <w:t>Hazelnoot</w:t>
+      </w:r>
+    </w:p>
+    <w:p>
+      <w:pPr>
+        <w:pStyle w:val="ListParagraph"/>
+        <w:numPr>
+          <w:ilvl w:val="0"/>
+          <w:numId w:val="2"/>
+        </w:numPr>
+      </w:pPr>
+      <w:r>
+        <w:t xml:space="preserve">+ </w:t>
+      </w:r>
+      <w:r>
+        <w:t>Bordeaux</w:t>
+      </w:r>
+    </w:p>
+    <w:p>
+      <w:pPr>
+        <w:pStyle w:val="ListParagraph"/>
+        <w:numPr>
+          <w:ilvl w:val="0"/>
+          <w:numId w:val="2"/>
+        </w:numPr>
+      </w:pPr>
+      <w:r>
+        <w:t>-</w:t>
+      </w:r>
+      <w:r>
+        <w:t xml:space="preserve"> </w:t>
+      </w:r>
+      <w:r>
+        <w:t>Wit</w:t>
+      </w:r>
+    </w:p>
+    <w:p>
+      <w:pPr>
+        <w:pStyle w:val="ListParagraph"/>
+        <w:numPr>
+          <w:ilvl w:val="0"/>
+          <w:numId w:val="2"/>
+        </w:numPr>
+      </w:pPr>
+      <w:r>
         <w:t xml:space="preserve">- </w:t>
       </w:r>
       <w:r>
-        <w:t>Kobalt</w:t>
+        <w:t>Groen</w:t>
       </w:r>
     </w:p>
     <w:p>
@@ -190,7 +369,7 @@
         <w:t xml:space="preserve">- </w:t>
       </w:r>
       <w:r>
-        <w:t>Zwart</w:t>
+        <w:t>Staalblauw</w:t>
       </w:r>
     </w:p>
     <w:p>
@@ -202,16 +381,62 @@
         </w:numPr>
       </w:pPr>
       <w:r>
+        <w:t xml:space="preserve">- </w:t>
+      </w:r>
+      <w:r>
+        <w:t>Grijs</w:t>
+      </w:r>
+    </w:p>
+    <w:p>
+      <w:pPr>
+        <w:pStyle w:val="ListParagraph"/>
+        <w:numPr>
+          <w:ilvl w:val="0"/>
+          <w:numId w:val="2"/>
+        </w:numPr>
+      </w:pPr>
+      <w:r>
+        <w:t xml:space="preserve">- </w:t>
+      </w:r>
+      <w:r>
+        <w:t>Lime</w:t>
+      </w:r>
+    </w:p>
+    <w:p>
+      <w:pPr>
+        <w:pStyle w:val="ListParagraph"/>
+        <w:numPr>
+          <w:ilvl w:val="0"/>
+          <w:numId w:val="2"/>
+        </w:numPr>
+      </w:pPr>
+      <w:r>
+        <w:t>-</w:t>
+      </w:r>
+      <w:r>
+        <w:t xml:space="preserve"> </w:t>
+      </w:r>
+      <w:r>
+        <w:t>Paar</w:t>
+      </w:r>
+      <w:r>
+        <w:t>s</w:t>
+      </w:r>
+    </w:p>
+    <w:p>
+      <w:pPr>
+        <w:pStyle w:val="ListParagraph"/>
+        <w:numPr>
+          <w:ilvl w:val="0"/>
+          <w:numId w:val="2"/>
+        </w:numPr>
+      </w:pPr>
+      <w:r>
         <w:t xml:space="preserve">+ </w:t>
       </w:r>
       <w:r>
-        <w:t xml:space="preserve">Rood </w:t>
-      </w:r>
-      <w:proofErr w:type="spellStart"/>
-      <w:r>
-        <w:t>rood</w:t>
-      </w:r>
-      <w:proofErr w:type="spellEnd"/>
+        <w:t>Lichtblauw</w:t>
+      </w:r>
     </w:p>
     <w:p>
       <w:pPr>
@@ -222,10 +447,10 @@
         </w:numPr>
       </w:pPr>
       <w:r>
-        <w:t xml:space="preserve">- </w:t>
-      </w:r>
-      <w:r>
-        <w:t>Den</w:t>
+        <w:t xml:space="preserve">+ </w:t>
+      </w:r>
+      <w:r>
+        <w:t>Donker mint</w:t>
       </w:r>
     </w:p>
     <w:p>
@@ -237,187 +462,7 @@
         </w:numPr>
       </w:pPr>
       <w:r>
-        <w:t xml:space="preserve">- </w:t>
-      </w:r>
-      <w:r>
-        <w:t>Fel oranje</w:t>
-      </w:r>
-    </w:p>
-    <w:p>
-      <w:pPr>
-        <w:pStyle w:val="ListParagraph"/>
-        <w:numPr>
-          <w:ilvl w:val="0"/>
-          <w:numId w:val="2"/>
-        </w:numPr>
-      </w:pPr>
-      <w:r>
-        <w:t xml:space="preserve">- </w:t>
-      </w:r>
-      <w:r>
-        <w:t>Geel</w:t>
-      </w:r>
-    </w:p>
-    <w:p>
-      <w:pPr>
-        <w:pStyle w:val="ListParagraph"/>
-        <w:numPr>
-          <w:ilvl w:val="0"/>
-          <w:numId w:val="2"/>
-        </w:numPr>
-      </w:pPr>
-      <w:r>
-        <w:t xml:space="preserve">- </w:t>
-      </w:r>
-      <w:r>
-        <w:t>Roze</w:t>
-      </w:r>
-    </w:p>
-    <w:p>
-      <w:pPr>
-        <w:pStyle w:val="ListParagraph"/>
-        <w:numPr>
-          <w:ilvl w:val="0"/>
-          <w:numId w:val="2"/>
-        </w:numPr>
-      </w:pPr>
-      <w:r>
-        <w:t xml:space="preserve">- </w:t>
-      </w:r>
-      <w:r>
-        <w:t>Hazelnoot</w:t>
-      </w:r>
-    </w:p>
-    <w:p>
-      <w:pPr>
-        <w:pStyle w:val="ListParagraph"/>
-        <w:numPr>
-          <w:ilvl w:val="0"/>
-          <w:numId w:val="2"/>
-        </w:numPr>
-      </w:pPr>
-      <w:r>
-        <w:t xml:space="preserve">+ </w:t>
-      </w:r>
-      <w:r>
-        <w:t>Bordeaux</w:t>
-      </w:r>
-    </w:p>
-    <w:p>
-      <w:pPr>
-        <w:pStyle w:val="ListParagraph"/>
-        <w:numPr>
-          <w:ilvl w:val="0"/>
-          <w:numId w:val="2"/>
-        </w:numPr>
-      </w:pPr>
-      <w:r>
-        <w:t xml:space="preserve">+ </w:t>
-      </w:r>
-      <w:r>
-        <w:t>Wit</w:t>
-      </w:r>
-    </w:p>
-    <w:p>
-      <w:pPr>
-        <w:pStyle w:val="ListParagraph"/>
-        <w:numPr>
-          <w:ilvl w:val="0"/>
-          <w:numId w:val="2"/>
-        </w:numPr>
-      </w:pPr>
-      <w:r>
-        <w:t xml:space="preserve">- </w:t>
-      </w:r>
-      <w:r>
-        <w:t>Groen</w:t>
-      </w:r>
-    </w:p>
-    <w:p>
-      <w:pPr>
-        <w:pStyle w:val="ListParagraph"/>
-        <w:numPr>
-          <w:ilvl w:val="0"/>
-          <w:numId w:val="2"/>
-        </w:numPr>
-      </w:pPr>
-      <w:r>
-        <w:t xml:space="preserve">- </w:t>
-      </w:r>
-      <w:r>
-        <w:t>Staalblauw</w:t>
-      </w:r>
-    </w:p>
-    <w:p>
-      <w:pPr>
-        <w:pStyle w:val="ListParagraph"/>
-        <w:numPr>
-          <w:ilvl w:val="0"/>
-          <w:numId w:val="2"/>
-        </w:numPr>
-      </w:pPr>
-      <w:r>
-        <w:t xml:space="preserve">- </w:t>
-      </w:r>
-      <w:r>
-        <w:t>Grijs</w:t>
-      </w:r>
-    </w:p>
-    <w:p>
-      <w:pPr>
-        <w:pStyle w:val="ListParagraph"/>
-        <w:numPr>
-          <w:ilvl w:val="0"/>
-          <w:numId w:val="2"/>
-        </w:numPr>
-      </w:pPr>
-      <w:r>
-        <w:t xml:space="preserve">- </w:t>
-      </w:r>
-      <w:r>
-        <w:t>Lime</w:t>
-      </w:r>
-    </w:p>
-    <w:p>
-      <w:pPr>
-        <w:pStyle w:val="ListParagraph"/>
-        <w:numPr>
-          <w:ilvl w:val="0"/>
-          <w:numId w:val="2"/>
-        </w:numPr>
-      </w:pPr>
-      <w:r>
-        <w:t xml:space="preserve">+ </w:t>
-      </w:r>
-      <w:r>
-        <w:t>Paar</w:t>
-      </w:r>
-      <w:r>
-        <w:t>s</w:t>
-      </w:r>
-    </w:p>
-    <w:p>
-      <w:pPr>
-        <w:pStyle w:val="ListParagraph"/>
-        <w:numPr>
-          <w:ilvl w:val="0"/>
-          <w:numId w:val="2"/>
-        </w:numPr>
-      </w:pPr>
-      <w:r>
-        <w:t>Lichtblauw</w:t>
-      </w:r>
-    </w:p>
-    <w:p>
-      <w:pPr>
-        <w:pStyle w:val="ListParagraph"/>
-        <w:numPr>
-          <w:ilvl w:val="0"/>
-          <w:numId w:val="2"/>
-        </w:numPr>
-      </w:pPr>
-      <w:r>
-        <w:t>Donker mint</w:t>
+        <w:t>– Ecru (nieuw)</w:t>
       </w:r>
     </w:p>
     <w:p/>

</xml_diff>